<commit_message>
Risk audit: drop stale templates/home.html evidence bullet
home.html was deleted in the previous commit when the welcome page
absorbed the mode-picker UI, so the citation under finding 1.3
("Liability for AI Therapy Advice") is now broken. The cited string
"AI-powered mental health support" never actually appeared in
home.html either, so the bullet was already stale evidence.

The remaining ai_therapist.py citations (counsellor / consulting room
language) still substantiate finding 1.3 on their own.

Also regenerates TogetherMindsAI_Risk_Audit.docx so the committed
artifact matches the script.
</commit_message>
<xml_diff>
--- a/TogetherMindsAI_Risk_Audit.docx
+++ b/TogetherMindsAI_Risk_Audit.docx
@@ -15,7 +15,7 @@
     </w:p>
     <w:p>
       <w:r>
-        <w:t>Generated: 13 April 2026</w:t>
+        <w:t>Generated: 14 May 2026</w:t>
       </w:r>
     </w:p>
     <w:p>
@@ -1729,14 +1729,6 @@
         <w:pStyle w:val="ListBullet"/>
       </w:pPr>
       <w:r>
-        <w:t>templates/home.html — "AI-powered mental health support"</w:t>
-      </w:r>
-    </w:p>
-    <w:p>
-      <w:pPr>
-        <w:pStyle w:val="ListBullet"/>
-      </w:pPr>
-      <w:r>
         <w:t>ai_therapist.py lines 226-292 — AI described as "a thoughtful, experienced counsellor"</w:t>
       </w:r>
     </w:p>

</xml_diff>